<commit_message>
Worksheet/test builder in the index: collect questions, reorder, edit text, drag and resize boxes on Letter pages, add text boxes, answer key, export PDF (print) or Word; fix doubled A)/B) labels on picture choices
Co-Authored-By: Claude Sonnet 5.5 <noreply@anthropic.com>
Claude-Session: https://claude.ai/code/session_01Q567TpajQd7bmbFDieU89t
</commit_message>
<xml_diff>
--- a/organic-chemistry/word-docs/Ch02_Molecular_Representations_Questions.docx
+++ b/organic-chemistry/word-docs/Ch02_Molecular_Representations_Questions.docx
@@ -233,14 +233,7 @@
           <w:tcPr>
             <w:tcW w:type="dxa" w:w="4824"/>
           </w:tcPr>
-          <w:p>
-            <w:r>
-              <w:rPr>
-                <w:b/>
-              </w:rPr>
-              <w:t>A)</w:t>
-            </w:r>
-          </w:p>
+          <w:p/>
           <w:p>
             <w:r>
               <w:drawing>
@@ -282,14 +275,7 @@
           <w:tcPr>
             <w:tcW w:type="dxa" w:w="4824"/>
           </w:tcPr>
-          <w:p>
-            <w:r>
-              <w:rPr>
-                <w:b/>
-              </w:rPr>
-              <w:t>B)</w:t>
-            </w:r>
-          </w:p>
+          <w:p/>
           <w:p>
             <w:r>
               <w:drawing>
@@ -333,14 +319,7 @@
           <w:tcPr>
             <w:tcW w:type="dxa" w:w="4824"/>
           </w:tcPr>
-          <w:p>
-            <w:r>
-              <w:rPr>
-                <w:b/>
-              </w:rPr>
-              <w:t>C)</w:t>
-            </w:r>
-          </w:p>
+          <w:p/>
           <w:p>
             <w:r>
               <w:drawing>
@@ -382,14 +361,7 @@
           <w:tcPr>
             <w:tcW w:type="dxa" w:w="4824"/>
           </w:tcPr>
-          <w:p>
-            <w:r>
-              <w:rPr>
-                <w:b/>
-              </w:rPr>
-              <w:t>D)</w:t>
-            </w:r>
-          </w:p>
+          <w:p/>
           <w:p>
             <w:r>
               <w:drawing>
@@ -1058,14 +1030,7 @@
           <w:tcPr>
             <w:tcW w:type="dxa" w:w="4824"/>
           </w:tcPr>
-          <w:p>
-            <w:r>
-              <w:rPr>
-                <w:b/>
-              </w:rPr>
-              <w:t>A)</w:t>
-            </w:r>
-          </w:p>
+          <w:p/>
           <w:p>
             <w:r>
               <w:drawing>
@@ -1107,14 +1072,7 @@
           <w:tcPr>
             <w:tcW w:type="dxa" w:w="4824"/>
           </w:tcPr>
-          <w:p>
-            <w:r>
-              <w:rPr>
-                <w:b/>
-              </w:rPr>
-              <w:t>B)</w:t>
-            </w:r>
-          </w:p>
+          <w:p/>
           <w:p>
             <w:r>
               <w:drawing>
@@ -1158,14 +1116,7 @@
           <w:tcPr>
             <w:tcW w:type="dxa" w:w="4824"/>
           </w:tcPr>
-          <w:p>
-            <w:r>
-              <w:rPr>
-                <w:b/>
-              </w:rPr>
-              <w:t>C)</w:t>
-            </w:r>
-          </w:p>
+          <w:p/>
           <w:p>
             <w:r>
               <w:drawing>
@@ -1207,14 +1158,7 @@
           <w:tcPr>
             <w:tcW w:type="dxa" w:w="4824"/>
           </w:tcPr>
-          <w:p>
-            <w:r>
-              <w:rPr>
-                <w:b/>
-              </w:rPr>
-              <w:t>D)</w:t>
-            </w:r>
-          </w:p>
+          <w:p/>
           <w:p>
             <w:r>
               <w:drawing>
@@ -2704,14 +2648,7 @@
           <w:tcPr>
             <w:tcW w:type="dxa" w:w="4824"/>
           </w:tcPr>
-          <w:p>
-            <w:r>
-              <w:rPr>
-                <w:b/>
-              </w:rPr>
-              <w:t>A)</w:t>
-            </w:r>
-          </w:p>
+          <w:p/>
           <w:p>
             <w:r>
               <w:drawing>
@@ -2753,14 +2690,7 @@
           <w:tcPr>
             <w:tcW w:type="dxa" w:w="4824"/>
           </w:tcPr>
-          <w:p>
-            <w:r>
-              <w:rPr>
-                <w:b/>
-              </w:rPr>
-              <w:t>B)</w:t>
-            </w:r>
-          </w:p>
+          <w:p/>
           <w:p>
             <w:r>
               <w:drawing>
@@ -2804,14 +2734,7 @@
           <w:tcPr>
             <w:tcW w:type="dxa" w:w="4824"/>
           </w:tcPr>
-          <w:p>
-            <w:r>
-              <w:rPr>
-                <w:b/>
-              </w:rPr>
-              <w:t>C)</w:t>
-            </w:r>
-          </w:p>
+          <w:p/>
           <w:p>
             <w:r>
               <w:drawing>
@@ -2853,14 +2776,7 @@
           <w:tcPr>
             <w:tcW w:type="dxa" w:w="4824"/>
           </w:tcPr>
-          <w:p>
-            <w:r>
-              <w:rPr>
-                <w:b/>
-              </w:rPr>
-              <w:t>D)</w:t>
-            </w:r>
-          </w:p>
+          <w:p/>
           <w:p>
             <w:r>
               <w:drawing>
@@ -4954,14 +4870,7 @@
           <w:tcPr>
             <w:tcW w:type="dxa" w:w="4824"/>
           </w:tcPr>
-          <w:p>
-            <w:r>
-              <w:rPr>
-                <w:b/>
-              </w:rPr>
-              <w:t>A)</w:t>
-            </w:r>
-          </w:p>
+          <w:p/>
           <w:p>
             <w:r>
               <w:drawing>
@@ -5003,14 +4912,7 @@
           <w:tcPr>
             <w:tcW w:type="dxa" w:w="4824"/>
           </w:tcPr>
-          <w:p>
-            <w:r>
-              <w:rPr>
-                <w:b/>
-              </w:rPr>
-              <w:t>B)</w:t>
-            </w:r>
-          </w:p>
+          <w:p/>
           <w:p>
             <w:r>
               <w:drawing>
@@ -5054,14 +4956,7 @@
           <w:tcPr>
             <w:tcW w:type="dxa" w:w="4824"/>
           </w:tcPr>
-          <w:p>
-            <w:r>
-              <w:rPr>
-                <w:b/>
-              </w:rPr>
-              <w:t>C)</w:t>
-            </w:r>
-          </w:p>
+          <w:p/>
           <w:p>
             <w:r>
               <w:drawing>
@@ -5103,14 +4998,7 @@
           <w:tcPr>
             <w:tcW w:type="dxa" w:w="4824"/>
           </w:tcPr>
-          <w:p>
-            <w:r>
-              <w:rPr>
-                <w:b/>
-              </w:rPr>
-              <w:t>D)</w:t>
-            </w:r>
-          </w:p>
+          <w:p/>
           <w:p>
             <w:r>
               <w:drawing>
@@ -5872,14 +5760,7 @@
           <w:tcPr>
             <w:tcW w:type="dxa" w:w="4824"/>
           </w:tcPr>
-          <w:p>
-            <w:r>
-              <w:rPr>
-                <w:b/>
-              </w:rPr>
-              <w:t>A)</w:t>
-            </w:r>
-          </w:p>
+          <w:p/>
           <w:p>
             <w:r>
               <w:drawing>
@@ -5921,14 +5802,7 @@
           <w:tcPr>
             <w:tcW w:type="dxa" w:w="4824"/>
           </w:tcPr>
-          <w:p>
-            <w:r>
-              <w:rPr>
-                <w:b/>
-              </w:rPr>
-              <w:t>B)</w:t>
-            </w:r>
-          </w:p>
+          <w:p/>
           <w:p>
             <w:r>
               <w:drawing>
@@ -5972,14 +5846,7 @@
           <w:tcPr>
             <w:tcW w:type="dxa" w:w="4824"/>
           </w:tcPr>
-          <w:p>
-            <w:r>
-              <w:rPr>
-                <w:b/>
-              </w:rPr>
-              <w:t>C)</w:t>
-            </w:r>
-          </w:p>
+          <w:p/>
           <w:p>
             <w:r>
               <w:drawing>
@@ -6021,14 +5888,7 @@
           <w:tcPr>
             <w:tcW w:type="dxa" w:w="4824"/>
           </w:tcPr>
-          <w:p>
-            <w:r>
-              <w:rPr>
-                <w:b/>
-              </w:rPr>
-              <w:t>D)</w:t>
-            </w:r>
-          </w:p>
+          <w:p/>
           <w:p>
             <w:r>
               <w:drawing>

</xml_diff>